<commit_message>
Add live Streamlit demo link to README, report and slides
Co-Authored-By: Claude Sonnet 5.5 <noreply@anthropic.com>
</commit_message>
<xml_diff>
--- a/Report_Vehicle_Price_Prediction.docx
+++ b/Report_Vehicle_Price_Prediction.docx
@@ -25,6 +25,11 @@
           <w:b w:val="0"/>
         </w:rPr>
         <w:t>Name: Lakshan B.D.    Index: 269136C    Date: 23 October 2026</w:t>
+      </w:r>
+    </w:p>
+    <w:p>
+      <w:r>
+        <w:t>Live demo: https://crazy-diya-ml-assignment-269136c-app-8yzt7l.streamlit.app/</w:t>
       </w:r>
     </w:p>
     <w:p>

</xml_diff>

<commit_message>
Add Azure deployment docs, MLOps slide and report section; gate tolerance
Co-Authored-By: Claude Sonnet 5.5 <noreply@anthropic.com>
</commit_message>
<xml_diff>
--- a/Report_Vehicle_Price_Prediction.docx
+++ b/Report_Vehicle_Price_Prediction.docx
@@ -1113,6 +1113,59 @@
         <w:pStyle w:val="Heading1"/>
       </w:pPr>
       <w:r>
+        <w:t>9. MLOps pipeline (bonus)</w:t>
+      </w:r>
+    </w:p>
+    <w:p>
+      <w:r>
+        <w:t>To keep the model reliable after deployment, the project includes an automated MLOps loop built on GitHub Actions and Azure.</w:t>
+      </w:r>
+    </w:p>
+    <w:p>
+      <w:pPr>
+        <w:pStyle w:val="ListBullet"/>
+      </w:pPr>
+      <w:r>
+        <w:t>CI: every push runs 9 automated tests (cleaning rules, model sanity, a release quality gate of R² ≥ 0.85 and MAPE ≤ 20%, and the app) and builds and health-checks the Docker image.</w:t>
+      </w:r>
+    </w:p>
+    <w:p>
+      <w:pPr>
+        <w:pStyle w:val="ListBullet"/>
+      </w:pPr>
+      <w:r>
+        <w:t>Monitoring: weekly, fresh ikman.lk ads (unseen by the model) are compared with the training data using PSI and KS tests, and the live model is scored on them. On 200 fresh ads the live error was MAPE 9.4% with no significant drift.</w:t>
+      </w:r>
+    </w:p>
+    <w:p>
+      <w:pPr>
+        <w:pStyle w:val="ListBullet"/>
+      </w:pPr>
+      <w:r>
+        <w:t>Retraining with a gate: on drift (or a forced run) a challenger is trained on old + fresh data. Both challenger and current model are scored on fresh ads neither saw; the challenger is promoted only if it is no worse (in a test: log-RMSE 0.1285 vs 0.1305). A pull request is opened for a human to approve.</w:t>
+      </w:r>
+    </w:p>
+    <w:p>
+      <w:pPr>
+        <w:pStyle w:val="ListBullet"/>
+      </w:pPr>
+      <w:r>
+        <w:t>Deployment: the app runs on Streamlit Cloud (redeploys on merge) and on Azure Container Apps (Malaysia West, scale-to-zero, about zero idle cost) from a Docker image published to GitHub Container Registry. Azure app: https://car-price-app.bluemeadow-a6e43a1f.malaysiawest.azurecontainerapps.io</w:t>
+      </w:r>
+    </w:p>
+    <w:p>
+      <w:pPr>
+        <w:pStyle w:val="ListBullet"/>
+      </w:pPr>
+      <w:r>
+        <w:t>Limitation: Streamlit Cloud and the free tier keep no persistent prediction log, so fresh ads stand in for production traffic when checking drift.</w:t>
+      </w:r>
+    </w:p>
+    <w:p>
+      <w:pPr>
+        <w:pStyle w:val="Heading1"/>
+      </w:pPr>
+      <w:r>
         <w:t>8. Conclusion, limitations and future work</w:t>
       </w:r>
     </w:p>

</xml_diff>

<commit_message>
Report: add algorithm comparison, bias/impact/ethics sections and PDF export
Co-Authored-By: Claude Sonnet 5.5 <noreply@anthropic.com>
</commit_message>
<xml_diff>
--- a/Report_Vehicle_Price_Prediction.docx
+++ b/Report_Vehicle_Price_Prediction.docx
@@ -1022,7 +1022,545 @@
         <w:pStyle w:val="Heading1"/>
       </w:pPr>
       <w:r>
-        <w:t>6. Explainability: SHAP and LIME</w:t>
+        <w:t>6. How the chosen algorithms differ from decision trees, logistic regression and k-NN</w:t>
+      </w:r>
+    </w:p>
+    <w:p>
+      <w:pPr/>
+      <w:r>
+        <w:t>The best models in this project are gradient-boosted tree ensembles (XGBoost, LightGBM, CatBoost) combined by stacking. They differ from the three standard models in several ways. Two notes on scope: logistic regression is a classifier, so for this regression task its counterpart, regularised linear regression (Ridge), was used as the baseline; and k-NN was not trained as a model here, so it is compared by its properties only, not by a measured score.</w:t>
+      </w:r>
+    </w:p>
+    <w:tbl>
+      <w:tblPr>
+        <w:tblStyle w:val="LightGrid-Accent1"/>
+        <w:tblW w:type="auto" w:w="0"/>
+        <w:tblLook w:firstColumn="1" w:firstRow="1" w:lastColumn="0" w:lastRow="0" w:noHBand="0" w:noVBand="1" w:val="04A0"/>
+      </w:tblPr>
+      <w:tblGrid>
+        <w:gridCol w:w="1930"/>
+        <w:gridCol w:w="1930"/>
+        <w:gridCol w:w="1930"/>
+        <w:gridCol w:w="1930"/>
+        <w:gridCol w:w="1930"/>
+      </w:tblGrid>
+      <w:tr>
+        <w:tc>
+          <w:tcPr>
+            <w:tcW w:type="dxa" w:w="1930"/>
+          </w:tcPr>
+          <w:p>
+            <w:r/>
+            <w:r>
+              <w:rPr>
+                <w:sz w:val="17"/>
+              </w:rPr>
+              <w:t>Aspect</w:t>
+            </w:r>
+          </w:p>
+        </w:tc>
+        <w:tc>
+          <w:tcPr>
+            <w:tcW w:type="dxa" w:w="1930"/>
+          </w:tcPr>
+          <w:p>
+            <w:r/>
+            <w:r>
+              <w:rPr>
+                <w:sz w:val="17"/>
+              </w:rPr>
+              <w:t>Decision tree</w:t>
+            </w:r>
+          </w:p>
+        </w:tc>
+        <w:tc>
+          <w:tcPr>
+            <w:tcW w:type="dxa" w:w="1930"/>
+          </w:tcPr>
+          <w:p>
+            <w:r/>
+            <w:r>
+              <w:rPr>
+                <w:sz w:val="17"/>
+              </w:rPr>
+              <w:t>Logistic / linear (Ridge)</w:t>
+            </w:r>
+          </w:p>
+        </w:tc>
+        <w:tc>
+          <w:tcPr>
+            <w:tcW w:type="dxa" w:w="1930"/>
+          </w:tcPr>
+          <w:p>
+            <w:r/>
+            <w:r>
+              <w:rPr>
+                <w:sz w:val="17"/>
+              </w:rPr>
+              <w:t>k-NN</w:t>
+            </w:r>
+          </w:p>
+        </w:tc>
+        <w:tc>
+          <w:tcPr>
+            <w:tcW w:type="dxa" w:w="1930"/>
+          </w:tcPr>
+          <w:p>
+            <w:r/>
+            <w:r>
+              <w:rPr>
+                <w:sz w:val="17"/>
+              </w:rPr>
+              <w:t>Boosting + stacking (this project)</w:t>
+            </w:r>
+          </w:p>
+        </w:tc>
+      </w:tr>
+      <w:tr>
+        <w:tc>
+          <w:tcPr>
+            <w:tcW w:type="dxa" w:w="1930"/>
+          </w:tcPr>
+          <w:p>
+            <w:r/>
+            <w:r>
+              <w:rPr>
+                <w:sz w:val="17"/>
+              </w:rPr>
+              <w:t>How it learns</w:t>
+            </w:r>
+          </w:p>
+        </w:tc>
+        <w:tc>
+          <w:tcPr>
+            <w:tcW w:type="dxa" w:w="1930"/>
+          </w:tcPr>
+          <w:p>
+            <w:r/>
+            <w:r>
+              <w:rPr>
+                <w:sz w:val="17"/>
+              </w:rPr>
+              <w:t>One set of if/then splits, chosen greedily</w:t>
+            </w:r>
+          </w:p>
+        </w:tc>
+        <w:tc>
+          <w:tcPr>
+            <w:tcW w:type="dxa" w:w="1930"/>
+          </w:tcPr>
+          <w:p>
+            <w:r/>
+            <w:r>
+              <w:rPr>
+                <w:sz w:val="17"/>
+              </w:rPr>
+              <w:t>One weighted sum of the features</w:t>
+            </w:r>
+          </w:p>
+        </w:tc>
+        <w:tc>
+          <w:tcPr>
+            <w:tcW w:type="dxa" w:w="1930"/>
+          </w:tcPr>
+          <w:p>
+            <w:r/>
+            <w:r>
+              <w:rPr>
+                <w:sz w:val="17"/>
+              </w:rPr>
+              <w:t>No training: stores all cars and averages the k closest</w:t>
+            </w:r>
+          </w:p>
+        </w:tc>
+        <w:tc>
+          <w:tcPr>
+            <w:tcW w:type="dxa" w:w="1930"/>
+          </w:tcPr>
+          <w:p>
+            <w:r/>
+            <w:r>
+              <w:rPr>
+                <w:sz w:val="17"/>
+              </w:rPr>
+              <w:t>Hundreds of small trees added one by one, each fitted to the errors of the previous ones; stacking learns how much to trust each booster</w:t>
+            </w:r>
+          </w:p>
+        </w:tc>
+      </w:tr>
+      <w:tr>
+        <w:tc>
+          <w:tcPr>
+            <w:tcW w:type="dxa" w:w="1930"/>
+          </w:tcPr>
+          <w:p>
+            <w:r/>
+            <w:r>
+              <w:rPr>
+                <w:sz w:val="17"/>
+              </w:rPr>
+              <w:t>Non-linearity and interactions</w:t>
+            </w:r>
+          </w:p>
+        </w:tc>
+        <w:tc>
+          <w:tcPr>
+            <w:tcW w:type="dxa" w:w="1930"/>
+          </w:tcPr>
+          <w:p>
+            <w:r/>
+            <w:r>
+              <w:rPr>
+                <w:sz w:val="17"/>
+              </w:rPr>
+              <w:t>Yes, but only one tree</w:t>
+            </w:r>
+          </w:p>
+        </w:tc>
+        <w:tc>
+          <w:tcPr>
+            <w:tcW w:type="dxa" w:w="1930"/>
+          </w:tcPr>
+          <w:p>
+            <w:r/>
+            <w:r>
+              <w:rPr>
+                <w:sz w:val="17"/>
+              </w:rPr>
+              <w:t>No: a straight-line effect per feature</w:t>
+            </w:r>
+          </w:p>
+        </w:tc>
+        <w:tc>
+          <w:tcPr>
+            <w:tcW w:type="dxa" w:w="1930"/>
+          </w:tcPr>
+          <w:p>
+            <w:r/>
+            <w:r>
+              <w:rPr>
+                <w:sz w:val="17"/>
+              </w:rPr>
+              <w:t>Yes, but only locally</w:t>
+            </w:r>
+          </w:p>
+        </w:tc>
+        <w:tc>
+          <w:tcPr>
+            <w:tcW w:type="dxa" w:w="1930"/>
+          </w:tcPr>
+          <w:p>
+            <w:r/>
+            <w:r>
+              <w:rPr>
+                <w:sz w:val="17"/>
+              </w:rPr>
+              <w:t>Yes, built up gradually (age x mileage x engine x condition)</w:t>
+            </w:r>
+          </w:p>
+        </w:tc>
+      </w:tr>
+      <w:tr>
+        <w:tc>
+          <w:tcPr>
+            <w:tcW w:type="dxa" w:w="1930"/>
+          </w:tcPr>
+          <w:p>
+            <w:r/>
+            <w:r>
+              <w:rPr>
+                <w:sz w:val="17"/>
+              </w:rPr>
+              <w:t>Over-fitting</w:t>
+            </w:r>
+          </w:p>
+        </w:tc>
+        <w:tc>
+          <w:tcPr>
+            <w:tcW w:type="dxa" w:w="1930"/>
+          </w:tcPr>
+          <w:p>
+            <w:r/>
+            <w:r>
+              <w:rPr>
+                <w:sz w:val="17"/>
+              </w:rPr>
+              <w:t>High variance: small data changes give a different tree</w:t>
+            </w:r>
+          </w:p>
+        </w:tc>
+        <w:tc>
+          <w:tcPr>
+            <w:tcW w:type="dxa" w:w="1930"/>
+          </w:tcPr>
+          <w:p>
+            <w:r/>
+            <w:r>
+              <w:rPr>
+                <w:sz w:val="17"/>
+              </w:rPr>
+              <w:t>Low variance but high bias (underfits depreciation)</w:t>
+            </w:r>
+          </w:p>
+        </w:tc>
+        <w:tc>
+          <w:tcPr>
+            <w:tcW w:type="dxa" w:w="1930"/>
+          </w:tcPr>
+          <w:p>
+            <w:r/>
+            <w:r>
+              <w:rPr>
+                <w:sz w:val="17"/>
+              </w:rPr>
+              <w:t>Sensitive to k and to noisy features</w:t>
+            </w:r>
+          </w:p>
+        </w:tc>
+        <w:tc>
+          <w:tcPr>
+            <w:tcW w:type="dxa" w:w="1930"/>
+          </w:tcPr>
+          <w:p>
+            <w:r/>
+            <w:r>
+              <w:rPr>
+                <w:sz w:val="17"/>
+              </w:rPr>
+              <w:t>Controlled by shallow trees, low learning rate, subsampling and regularisation, tuned by 5-fold CV</w:t>
+            </w:r>
+          </w:p>
+        </w:tc>
+      </w:tr>
+      <w:tr>
+        <w:tc>
+          <w:tcPr>
+            <w:tcW w:type="dxa" w:w="1930"/>
+          </w:tcPr>
+          <w:p>
+            <w:r/>
+            <w:r>
+              <w:rPr>
+                <w:sz w:val="17"/>
+              </w:rPr>
+              <w:t>Many categories (351 car models, 166 locations)</w:t>
+            </w:r>
+          </w:p>
+        </w:tc>
+        <w:tc>
+          <w:tcPr>
+            <w:tcW w:type="dxa" w:w="1930"/>
+          </w:tcPr>
+          <w:p>
+            <w:r/>
+            <w:r>
+              <w:rPr>
+                <w:sz w:val="17"/>
+              </w:rPr>
+              <w:t>Needs encoding; rare groups give unstable splits</w:t>
+            </w:r>
+          </w:p>
+        </w:tc>
+        <w:tc>
+          <w:tcPr>
+            <w:tcW w:type="dxa" w:w="1930"/>
+          </w:tcPr>
+          <w:p>
+            <w:r/>
+            <w:r>
+              <w:rPr>
+                <w:sz w:val="17"/>
+              </w:rPr>
+              <w:t>Needs one-hot encoding: very wide</w:t>
+            </w:r>
+          </w:p>
+        </w:tc>
+        <w:tc>
+          <w:tcPr>
+            <w:tcW w:type="dxa" w:w="1930"/>
+          </w:tcPr>
+          <w:p>
+            <w:r/>
+            <w:r>
+              <w:rPr>
+                <w:sz w:val="17"/>
+              </w:rPr>
+              <w:t>Distance between two categories is meaningless</w:t>
+            </w:r>
+          </w:p>
+        </w:tc>
+        <w:tc>
+          <w:tcPr>
+            <w:tcW w:type="dxa" w:w="1930"/>
+          </w:tcPr>
+          <w:p>
+            <w:r/>
+            <w:r>
+              <w:rPr>
+                <w:sz w:val="17"/>
+              </w:rPr>
+              <w:t>CatBoost handles categories natively (ordered target statistics); rare ones are grouped</w:t>
+            </w:r>
+          </w:p>
+        </w:tc>
+      </w:tr>
+      <w:tr>
+        <w:tc>
+          <w:tcPr>
+            <w:tcW w:type="dxa" w:w="1930"/>
+          </w:tcPr>
+          <w:p>
+            <w:r/>
+            <w:r>
+              <w:rPr>
+                <w:sz w:val="17"/>
+              </w:rPr>
+              <w:t>Feature scaling</w:t>
+            </w:r>
+          </w:p>
+        </w:tc>
+        <w:tc>
+          <w:tcPr>
+            <w:tcW w:type="dxa" w:w="1930"/>
+          </w:tcPr>
+          <w:p>
+            <w:r/>
+            <w:r>
+              <w:rPr>
+                <w:sz w:val="17"/>
+              </w:rPr>
+              <w:t>Not needed</w:t>
+            </w:r>
+          </w:p>
+        </w:tc>
+        <w:tc>
+          <w:tcPr>
+            <w:tcW w:type="dxa" w:w="1930"/>
+          </w:tcPr>
+          <w:p>
+            <w:r/>
+            <w:r>
+              <w:rPr>
+                <w:sz w:val="17"/>
+              </w:rPr>
+              <w:t>Needed</w:t>
+            </w:r>
+          </w:p>
+        </w:tc>
+        <w:tc>
+          <w:tcPr>
+            <w:tcW w:type="dxa" w:w="1930"/>
+          </w:tcPr>
+          <w:p>
+            <w:r/>
+            <w:r>
+              <w:rPr>
+                <w:sz w:val="17"/>
+              </w:rPr>
+              <w:t>Needed: mileage in km would dominate the distance</w:t>
+            </w:r>
+          </w:p>
+        </w:tc>
+        <w:tc>
+          <w:tcPr>
+            <w:tcW w:type="dxa" w:w="1930"/>
+          </w:tcPr>
+          <w:p>
+            <w:r/>
+            <w:r>
+              <w:rPr>
+                <w:sz w:val="17"/>
+              </w:rPr>
+              <w:t>Not needed</w:t>
+            </w:r>
+          </w:p>
+        </w:tc>
+      </w:tr>
+      <w:tr>
+        <w:tc>
+          <w:tcPr>
+            <w:tcW w:type="dxa" w:w="1930"/>
+          </w:tcPr>
+          <w:p>
+            <w:r/>
+            <w:r>
+              <w:rPr>
+                <w:sz w:val="17"/>
+              </w:rPr>
+              <w:t>Result on this data (test set)</w:t>
+            </w:r>
+          </w:p>
+        </w:tc>
+        <w:tc>
+          <w:tcPr>
+            <w:tcW w:type="dxa" w:w="1930"/>
+          </w:tcPr>
+          <w:p>
+            <w:r/>
+            <w:r>
+              <w:rPr>
+                <w:sz w:val="17"/>
+              </w:rPr>
+              <w:t>MAPE 23.5%, R2 0.735</w:t>
+            </w:r>
+          </w:p>
+        </w:tc>
+        <w:tc>
+          <w:tcPr>
+            <w:tcW w:type="dxa" w:w="1930"/>
+          </w:tcPr>
+          <w:p>
+            <w:r/>
+            <w:r>
+              <w:rPr>
+                <w:sz w:val="17"/>
+              </w:rPr>
+              <w:t>MAPE 16.7%, R2 0.761</w:t>
+            </w:r>
+          </w:p>
+        </w:tc>
+        <w:tc>
+          <w:tcPr>
+            <w:tcW w:type="dxa" w:w="1930"/>
+          </w:tcPr>
+          <w:p>
+            <w:r/>
+            <w:r>
+              <w:rPr>
+                <w:sz w:val="17"/>
+              </w:rPr>
+              <w:t>Not measured</w:t>
+            </w:r>
+          </w:p>
+        </w:tc>
+        <w:tc>
+          <w:tcPr>
+            <w:tcW w:type="dxa" w:w="1930"/>
+          </w:tcPr>
+          <w:p>
+            <w:r/>
+            <w:r>
+              <w:rPr>
+                <w:sz w:val="17"/>
+              </w:rPr>
+              <w:t>MAPE 12.6%, R2 0.914 (stacking)</w:t>
+            </w:r>
+          </w:p>
+        </w:tc>
+      </w:tr>
+    </w:tbl>
+    <w:p>
+      <w:pPr/>
+      <w:r>
+        <w:t>Why this matters for car prices: depreciation is non-linear and depends on interactions (a 2 000 cc engine is worth more in a new car than in an old one), the data has many categorical values and only about 2,400 training rows, and the target is noisy. A single tree is unstable here, a linear model is too rigid, and k-NN suffers because cars with the same specification are rare for uncommon models. Boosting reduces both bias and variance, and stacking adds a further small gain by weighting the three boosters (about 64% CatBoost, 24% XGBoost, 14% LightGBM). The cost is lower interpretability and more tuning, which is why SHAP and LIME (section 7) were added.</w:t>
+      </w:r>
+    </w:p>
+    <w:p>
+      <w:pPr>
+        <w:pStyle w:val="Heading1"/>
+      </w:pPr>
+      <w:r>
+        <w:t>7. Explainability: SHAP and LIME</w:t>
       </w:r>
     </w:p>
     <w:p>
@@ -1097,7 +1635,7 @@
         <w:pStyle w:val="Heading1"/>
       </w:pPr>
       <w:r>
-        <w:t>7. Inference and application</w:t>
+        <w:t>8. Inference and application</w:t>
       </w:r>
     </w:p>
     <w:p>
@@ -1166,7 +1704,193 @@
         <w:pStyle w:val="Heading1"/>
       </w:pPr>
       <w:r>
-        <w:t>8. Conclusion, limitations and future work</w:t>
+        <w:t>10. Bias, fairness, real-world impact and ethics</w:t>
+      </w:r>
+    </w:p>
+    <w:p>
+      <w:pPr>
+        <w:pStyle w:val="Heading2"/>
+      </w:pPr>
+      <w:r>
+        <w:t>Risk of bias or unfairness</w:t>
+      </w:r>
+    </w:p>
+    <w:p>
+      <w:pPr>
+        <w:pStyle w:val="ListBullet"/>
+      </w:pPr>
+      <w:r>
+        <w:rPr>
+          <w:b/>
+        </w:rPr>
+        <w:t xml:space="preserve">Selection bias. </w:t>
+      </w:r>
+      <w:r>
+        <w:t>The data covers only ads on ikman.lk, so it reflects sellers who advertise online. The dataset is concentrated in a few areas (Kohuwala alone is 11% of ads, the top five locations about 33%), 137 of the 166 locations have fewer than 30 ads, and Toyota, Suzuki and Honda make up about 58% of the cars. Buyers or sellers outside the Colombo suburbs are therefore less well represented.</w:t>
+      </w:r>
+    </w:p>
+    <w:p>
+      <w:pPr>
+        <w:pStyle w:val="ListBullet"/>
+      </w:pPr>
+      <w:r>
+        <w:rPr>
+          <w:b/>
+        </w:rPr>
+        <w:t xml:space="preserve">Unequal accuracy across groups. </w:t>
+      </w:r>
+      <w:r>
+        <w:t>Popular cars have many comparables; vintage cars (130 ads before 2000) and expensive cars (about 10% above LKR 30 million) have few. Errors there are larger, for example the 2007 Hyundai Santa Fe was over-estimated by about 33%. A seller of a rare car could be given a less reliable price than a seller of a common one.</w:t>
+      </w:r>
+    </w:p>
+    <w:p>
+      <w:pPr>
+        <w:pStyle w:val="ListBullet"/>
+      </w:pPr>
+      <w:r>
+        <w:rPr>
+          <w:b/>
+        </w:rPr>
+        <w:t xml:space="preserve">Location as a proxy. </w:t>
+      </w:r>
+      <w:r>
+        <w:t>Location is a model input. It can encode the wealth of an area, not the quality of the car, and rare locations are grouped as "Other", which treats small towns as one block. Seller type (dealer or private) and seller identity are not model features, so the model does not price by who is selling, but location can still correlate with it.</w:t>
+      </w:r>
+    </w:p>
+    <w:p>
+      <w:pPr>
+        <w:pStyle w:val="ListBullet"/>
+      </w:pPr>
+      <w:r>
+        <w:rPr>
+          <w:b/>
+        </w:rPr>
+        <w:t xml:space="preserve">Learning seller behaviour. </w:t>
+      </w:r>
+      <w:r>
+        <w:t>The target is the asking price. If dealers or some regions habitually ask for more, the model learns and repeats that, and it does not know the true sale price.</w:t>
+      </w:r>
+    </w:p>
+    <w:p>
+      <w:pPr>
+        <w:pStyle w:val="Heading2"/>
+      </w:pPr>
+      <w:r>
+        <w:t>Real-world impact</w:t>
+      </w:r>
+    </w:p>
+    <w:p>
+      <w:pPr>
+        <w:pStyle w:val="ListBullet"/>
+      </w:pPr>
+      <w:r>
+        <w:rPr>
+          <w:b/>
+        </w:rPr>
+        <w:t xml:space="preserve">Benefits. </w:t>
+      </w:r>
+      <w:r>
+        <w:t>A buyer or seller with little market knowledge gets a quick reference price and can spot an ad that is far above or below the usual level, which reduces information asymmetry in a market where import restrictions made prices hard to judge.</w:t>
+      </w:r>
+    </w:p>
+    <w:p>
+      <w:pPr>
+        <w:pStyle w:val="ListBullet"/>
+      </w:pPr>
+      <w:r>
+        <w:rPr>
+          <w:b/>
+        </w:rPr>
+        <w:t xml:space="preserve">Harms if misused. </w:t>
+      </w:r>
+      <w:r>
+        <w:t>An error of 13% on a LKR 10 million car is about LKR 1.3 million. If the estimate is treated as a fixed valuation it could anchor negotiations unfairly, and it should not be used for loans, insurance or tax. If many sellers price from the same tool, it could also push asking prices together. For this reason the app shows a range, labels the result as an estimate of the asking price, and is described as decision support.</w:t>
+      </w:r>
+    </w:p>
+    <w:p>
+      <w:pPr>
+        <w:pStyle w:val="ListBullet"/>
+      </w:pPr>
+      <w:r>
+        <w:rPr>
+          <w:b/>
+        </w:rPr>
+        <w:t xml:space="preserve">Changing market. </w:t>
+      </w:r>
+      <w:r>
+        <w:t>Prices depend on import policy, exchange rates and fuel prices, so the model goes stale. The MLOps pipeline (section 9) checks drift every week, and a retrained model is promoted only after passing a quality gate and a human approval.</w:t>
+      </w:r>
+    </w:p>
+    <w:p>
+      <w:pPr>
+        <w:pStyle w:val="Heading2"/>
+      </w:pPr>
+      <w:r>
+        <w:t>Ethical use of data</w:t>
+      </w:r>
+    </w:p>
+    <w:p>
+      <w:pPr>
+        <w:pStyle w:val="ListBullet"/>
+      </w:pPr>
+      <w:r>
+        <w:rPr>
+          <w:b/>
+        </w:rPr>
+        <w:t xml:space="preserve">Collection. </w:t>
+      </w:r>
+      <w:r>
+        <w:t>Only publicly visible adverts were collected, the site's robots.txt was respected, requests were spaced 1.5 seconds apart, and no login or protection was bypassed (a second site, Riyasewana, refused automated access and was not circumvented). The data is used for coursework and the source is cited.</w:t>
+      </w:r>
+    </w:p>
+    <w:p>
+      <w:pPr>
+        <w:pStyle w:val="ListBullet"/>
+      </w:pPr>
+      <w:r>
+        <w:rPr>
+          <w:b/>
+        </w:rPr>
+        <w:t xml:space="preserve">Personal data. </w:t>
+      </w:r>
+      <w:r>
+        <w:t>The model uses only vehicle attributes, price and general location. Sellers' names and contact details are not used. The free-text description column can contain phone numbers, so it is not a model input and should be removed or anonymised before the dataset is shared more widely.</w:t>
+      </w:r>
+    </w:p>
+    <w:p>
+      <w:pPr>
+        <w:pStyle w:val="ListBullet"/>
+      </w:pPr>
+      <w:r>
+        <w:rPr>
+          <w:b/>
+        </w:rPr>
+        <w:t xml:space="preserve">Transparency and oversight. </w:t>
+      </w:r>
+      <w:r>
+        <w:t>SHAP and LIME explain predictions, the limits are stated, retraining needs a person to approve, and the application does not log users' inputs.</w:t>
+      </w:r>
+    </w:p>
+    <w:p>
+      <w:pPr>
+        <w:pStyle w:val="ListBullet"/>
+      </w:pPr>
+      <w:r>
+        <w:rPr>
+          <w:b/>
+        </w:rPr>
+        <w:t xml:space="preserve">Remaining limits. </w:t>
+      </w:r>
+      <w:r>
+        <w:t>No fairness metric across regions or seller groups was measured, because the data has no seller attributes beyond a membership flag. A future version should report error by price band and by area and collect more rural and luxury listings.</w:t>
+      </w:r>
+    </w:p>
+    <w:p>
+      <w:pPr>
+        <w:pStyle w:val="Heading1"/>
+      </w:pPr>
+      <w:r>
+        <w:t>11. Conclusion, limitations and future work</w:t>
       </w:r>
     </w:p>
     <w:p>

</xml_diff>